<commit_message>
Format variables templates: conversion {{ VAR }} vers _VAR_ (29 fichiers, 589 variables) + adaptation code
- Script scripts/convertir_variables_underscore.php applique (backups locaux, non versionnes)
- DocumentRenderer: remplacement _CLE_ en priorite, boucles _c.X_/_a.X_/_r.X_/_a_, normalisation des tokens _VAR_ coupes entre runs (cles connues + regex)
- TemplateAnalyzer: extraction par noeud w:t + passe cles connues (tokens colles aux cellules), suppression/renommage acceptent les deux formats
- Pages UI (variables, inspecteur, editeur, analyse-couverture): affichage/copie/drag-drop au format _VAR_
- Anciens {{ VAR }} toujours supportes en secours; tests: 433 vars extraites, 0 token residuel apres rendu
</commit_message>
<xml_diff>
--- a/templates/SARL AU/2026-03_Statuts_Template.docx
+++ b/templates/SARL AU/2026-03_Statuts_Template.docx
@@ -104,7 +104,7 @@
           <w:color w:val="7030A0"/>
           <w:lang w:val="fr-FR"/>
         </w:rPr>
-        <w:t xml:space="preserve">{{ SOCIETE_RAISON_SOCIALE }} </w:t>
+        <w:t xml:space="preserve">_SOCIETE_RAISON_SOCIALE_ </w:t>
       </w:r>
       <w:r>
         <w:rPr>
@@ -115,7 +115,7 @@
           <w:color w:val="7030A0"/>
           <w:lang w:val="fr-FR"/>
         </w:rPr>
-        <w:t xml:space="preserve">{{ SOCIETE_FORME_JURIDIQUE }}</w:t>
+        <w:t xml:space="preserve">_SOCIETE_FORME_JURIDIQUE_</w:t>
       </w:r>
     </w:p>
     <w:p>
@@ -142,7 +142,7 @@
           <w:color w:val="7030A0"/>
           <w:lang w:val="fr-FR"/>
         </w:rPr>
-        <w:t xml:space="preserve">{{ SOCIETE_CAPITAL }}</w:t>
+        <w:t xml:space="preserve">_SOCIETE_CAPITAL_</w:t>
       </w:r>
       <w:r>
         <w:rPr>
@@ -224,7 +224,7 @@
           <w:color w:val="7030A0"/>
           <w:lang w:val="fr-FR"/>
         </w:rPr>
-        <w:t xml:space="preserve">{{ SOCIETE_ADRESSE_SIEGE }} -</w:t>
+        <w:t xml:space="preserve">_SOCIETE_ADRESSE_SIEGE_ -</w:t>
       </w:r>
       <w:r>
         <w:rPr>
@@ -273,7 +273,7 @@
           <w:color w:val="7030A0"/>
           <w:lang w:val="fr-FR"/>
         </w:rPr>
-        <w:t xml:space="preserve">{{ SOCIETE_ICE }}</w:t>
+        <w:t xml:space="preserve">_SOCIETE_ICE_</w:t>
       </w:r>
     </w:p>
     <w:p>
@@ -315,27 +315,27 @@
           <w:szCs w:val="22"/>
           <w:lang w:val="fr-FR"/>
         </w:rPr>
-        <w:t xml:space="preserve">{{ ASSOCIE_CIVILITE }}</w:t>
-      </w:r>
-      <w:r>
-        <w:rPr>
-          <w:b/>
-          <w:bCs/>
-          <w:sz w:val="22"/>
-          <w:szCs w:val="22"/>
-          <w:lang w:val="fr-FR"/>
-        </w:rPr>
-        <w:t xml:space="preserve">{{ ASSOCIE_PRENOM }}</w:t>
-      </w:r>
-      <w:r>
-        <w:rPr>
-          <w:b/>
-          <w:bCs/>
-          <w:sz w:val="22"/>
-          <w:szCs w:val="22"/>
-          <w:lang w:val="fr-FR"/>
-        </w:rPr>
-        <w:t xml:space="preserve">{{ ASSOCIE_NOM }} </w:t>
+        <w:t xml:space="preserve">_ASSOCIE_CIVILITE_</w:t>
+      </w:r>
+      <w:r>
+        <w:rPr>
+          <w:b/>
+          <w:bCs/>
+          <w:sz w:val="22"/>
+          <w:szCs w:val="22"/>
+          <w:lang w:val="fr-FR"/>
+        </w:rPr>
+        <w:t xml:space="preserve">_ASSOCIE_PRENOM_</w:t>
+      </w:r>
+      <w:r>
+        <w:rPr>
+          <w:b/>
+          <w:bCs/>
+          <w:sz w:val="22"/>
+          <w:szCs w:val="22"/>
+          <w:lang w:val="fr-FR"/>
+        </w:rPr>
+        <w:t xml:space="preserve">_ASSOCIE_NOM_ </w:t>
       </w:r>
       <w:r>
         <w:rPr>
@@ -355,7 +355,7 @@
           <w:szCs w:val="22"/>
           <w:lang w:val="fr-FR"/>
         </w:rPr>
-        <w:t xml:space="preserve">{{ ASSOCIE_NATIONALITE }}</w:t>
+        <w:t xml:space="preserve">_ASSOCIE_NATIONALITE_</w:t>
       </w:r>
       <w:r>
         <w:rPr>
@@ -425,7 +425,7 @@
           <w:szCs w:val="22"/>
           <w:lang w:val="fr-FR"/>
         </w:rPr>
-        <w:t xml:space="preserve">{{ ASSOCIE_CIN }}</w:t>
+        <w:t xml:space="preserve">_ASSOCIE_CIN_</w:t>
       </w:r>
       <w:r>
         <w:rPr>
@@ -445,7 +445,7 @@
           <w:szCs w:val="22"/>
           <w:lang w:val="fr-FR"/>
         </w:rPr>
-        <w:t xml:space="preserve">{{ ASSOCIE_DATE_NAISSANCE }} </w:t>
+        <w:t xml:space="preserve">_ASSOCIE_DATE_NAISSANCE_ </w:t>
       </w:r>
       <w:r>
         <w:rPr>
@@ -465,7 +465,7 @@
           <w:szCs w:val="22"/>
           <w:lang w:val="fr-FR"/>
         </w:rPr>
-        <w:t xml:space="preserve">{{ ASSOCIE_LIEU_NAISSANCE }}</w:t>
+        <w:t xml:space="preserve">_ASSOCIE_LIEU_NAISSANCE_</w:t>
       </w:r>
       <w:r>
         <w:rPr>
@@ -495,7 +495,7 @@
           <w:szCs w:val="22"/>
           <w:lang w:val="fr-FR"/>
         </w:rPr>
-        <w:t xml:space="preserve">{{ ASSOCIE_ADRESSE }}</w:t>
+        <w:t xml:space="preserve">_ASSOCIE_ADRESSE_</w:t>
       </w:r>
       <w:r>
         <w:rPr>
@@ -668,7 +668,7 @@
           <w:color w:val="000000"/>
           <w:lang w:val="fr-FR"/>
         </w:rPr>
-        <w:t xml:space="preserve">{{ SOCIETE_RAISON_SOCIALE }} </w:t>
+        <w:t xml:space="preserve">_SOCIETE_RAISON_SOCIALE_ </w:t>
       </w:r>
       <w:r>
         <w:rPr>
@@ -757,7 +757,7 @@
           <w:szCs w:val="22"/>
           <w:lang w:val="fr-FR"/>
         </w:rPr>
-        <w:t xml:space="preserve">•  {{ a }}</w:t>
+        <w:t xml:space="preserve">•  _a_</w:t>
       </w:r>
     </w:p>
     <w:p>
@@ -851,7 +851,7 @@
           <w:szCs w:val="22"/>
           <w:lang w:val="fr-FR"/>
         </w:rPr>
-        <w:t xml:space="preserve">{{ SOCIETE_ADRESSE_SIEGE }} -</w:t>
+        <w:t xml:space="preserve">_SOCIETE_ADRESSE_SIEGE_ -</w:t>
       </w:r>
       <w:r>
         <w:rPr>
@@ -1003,7 +1003,7 @@
           <w:szCs w:val="22"/>
           <w:lang w:val="fr-FR"/>
         </w:rPr>
-        <w:t xml:space="preserve">{{ SOCIETE_CAPITAL }}</w:t>
+        <w:t xml:space="preserve">_SOCIETE_CAPITAL_</w:t>
       </w:r>
       <w:r>
         <w:rPr>
@@ -1031,7 +1031,7 @@
           <w:szCs w:val="22"/>
           <w:lang w:val="fr-FR"/>
         </w:rPr>
-        <w:t xml:space="preserve">{{ SOCIETE_PART_SOCIAL }}</w:t>
+        <w:t xml:space="preserve">_SOCIETE_PART_SOCIAL_</w:t>
       </w:r>
       <w:r>
         <w:rPr>
@@ -1082,22 +1082,22 @@
           <w:szCs w:val="22"/>
           <w:lang w:val="fr-FR"/>
         </w:rPr>
-        <w:t xml:space="preserve">- {{ ASSOCIE_CIVILITE }} {{ ASSOCIE_PRENOM }} {{ ASSOCIE_NOM }} ---------------------------------------------------{{ SOCIETE_PART_SOCIAL }} Parts.</w:t>
-      </w:r>
-    </w:p>
-    <w:p>
-      <w:pPr>
-        <w:jc w:val="both"/>
-      </w:pPr>
-      <w:r>
-        <w:rPr>
-          <w:b/>
-          <w:bCs/>
-          <w:sz w:val="22"/>
-          <w:szCs w:val="22"/>
-          <w:lang w:val="fr-FR"/>
-        </w:rPr>
-        <w:t xml:space="preserve">- {{ ASSOCIE_CIVILITE }} {{ ASSOCIE_PRENOM }} {{ ASSOCIE_NOM }} -------------------------------------------------{{ SOCIETE_CAPITAL }} DHS.</w:t>
+        <w:t xml:space="preserve">- _ASSOCIE_CIVILITE_ _ASSOCIE_PRENOM_ _ASSOCIE_NOM_ ---------------------------------------------------_SOCIETE_PART_SOCIAL_ Parts.</w:t>
+      </w:r>
+    </w:p>
+    <w:p>
+      <w:pPr>
+        <w:jc w:val="both"/>
+      </w:pPr>
+      <w:r>
+        <w:rPr>
+          <w:b/>
+          <w:bCs/>
+          <w:sz w:val="22"/>
+          <w:szCs w:val="22"/>
+          <w:lang w:val="fr-FR"/>
+        </w:rPr>
+        <w:t xml:space="preserve">- _ASSOCIE_CIVILITE_ _ASSOCIE_PRENOM_ _ASSOCIE_NOM_ -------------------------------------------------_SOCIETE_CAPITAL_ DHS.</w:t>
       </w:r>
     </w:p>
     <w:p>
@@ -1408,7 +1408,7 @@
           <w:szCs w:val="22"/>
           <w:lang w:val="fr-FR"/>
         </w:rPr>
-        <w:t xml:space="preserve">{{ ASSOCIE_CIVILITE }} {{ ASSOCIE_PRENOM }} {{ ASSOCIE_NOM }} de Nationalité {{ ASSOCIE_NATIONALITE }}, titulaire de la CIN N° {{ ASSOCIE_CIN }}, né le {{ ASSOCIE_DATE_NAISSANCE }} à {{ ASSOCIE_LIEU_NAISSANCE }}, demeurant à {{ ASSOCIE_ADRESSE }}.</w:t>
+        <w:t xml:space="preserve">_ASSOCIE_CIVILITE_ _ASSOCIE_PRENOM_ _ASSOCIE_NOM_ de Nationalité _ASSOCIE_NATIONALITE_, titulaire de la CIN N° _ASSOCIE_CIN_, né le _ASSOCIE_DATE_NAISSANCE_ à _ASSOCIE_LIEU_NAISSANCE_, demeurant à _ASSOCIE_ADRESSE_.</w:t>
       </w:r>
     </w:p>
     <w:p>
@@ -2636,7 +2636,7 @@
           <w:szCs w:val="22"/>
           <w:lang w:val="fr-FR"/>
         </w:rPr>
-        <w:t xml:space="preserve">Les statuts seront déposés au greffier du tribunal de commerce de {{ SOCIETE_TRIBUNAL }}.</w:t>
+        <w:t xml:space="preserve">Les statuts seront déposés au greffier du tribunal de commerce de _SOCIETE_TRIBUNAL_.</w:t>
       </w:r>
     </w:p>
     <w:p>
@@ -2731,7 +2731,7 @@
           <w:szCs w:val="22"/>
           <w:lang w:val="fr-FR"/>
         </w:rPr>
-        <w:t xml:space="preserve">{{ ASSOCIE_CIVILITE }} {{ ASSOCIE_PRENOM }} {{ ASSOCIE_NOM }} </w:t>
+        <w:t xml:space="preserve">_ASSOCIE_CIVILITE_ _ASSOCIE_PRENOM_ _ASSOCIE_NOM_ </w:t>
       </w:r>
     </w:p>
     <w:p>
@@ -2747,7 +2747,7 @@
           <w:szCs w:val="24"/>
           <w:lang w:val="fr-FR"/>
         </w:rPr>
-        <w:t xml:space="preserve">{{ ASSOCIE_QUALITE }}</w:t>
+        <w:t xml:space="preserve">_ASSOCIE_QUALITE_</w:t>
       </w:r>
     </w:p>
   </w:body>

</xml_diff>